<commit_message>
Pi5 GPIO21でPTT ON出力、ESP32 W5500なしでPA/LNA制御可能に
- Shonan送信開始/停止に連動してPi5 GPIO21(40番ピン)をHIGH/LOW
  (Langstone V3のTx Outputと同じピン、pinctrlでラインを保持せず書き込み)
- アプリ起動時にGPIO21をLOWへ初期化
- README・操作説明書(アプリ内Help/DOCX)に日英で記載

Co-Authored-By: Claude Opus 5.5 <noreply@anthropic.com>
</commit_message>
<xml_diff>
--- a/pi5/docs/shonan_pi5_operation_manual.docx
+++ b/pi5/docs/shonan_pi5_operation_manual.docx
@@ -279,6 +279,15 @@
       </w:pPr>
       <w:r>
         <w:t>PA_Power/PTTコントローラ（ESP32） / PA_Power/PTT Controller (ESP32)</w:t>
+      </w:r>
+    </w:p>
+    <w:p>
+      <w:pPr>
+        <w:pStyle w:val="ListBullet2"/>
+        <w:spacing w:after="40"/>
+      </w:pPr>
+      <w:r>
+        <w:t>ESP32 W5500なしでのPA/LNA制御 / PA/LNA control without ESP32 W5500</w:t>
       </w:r>
     </w:p>
     <w:p>
@@ -1501,6 +1510,27 @@
           <w:color w:val="404040"/>
         </w:rPr>
         <w:t>Choose whether to use the PA_Power/PTT controller (ESP32 + W5500, hardware/W5500_PA_PTT_Control) with "Use ESP32 W5500", and enter its IP address. The link is disabled when it is OFF or the address is empty (the IP address is kept even when OFF). When used, PTT follows TX start/stop and the 12 V power (including the Pluto+) is switched ON/OFF automatically at app start/exit. A manual power cycle (OFF → wait 3 seconds → ON) is also available from the "Pluto Power" card (optional feature) on the Home screen.</w:t>
+      </w:r>
+    </w:p>
+    <w:p>
+      <w:pPr>
+        <w:pStyle w:val="Heading2"/>
+      </w:pPr>
+      <w:r>
+        <w:t>ESP32 W5500なしでのPA/LNA制御 / PA/LNA control without ESP32 W5500</w:t>
+      </w:r>
+    </w:p>
+    <w:p>
+      <w:r>
+        <w:t>ESP32 W5500(PA_Power/PTTコントローラ)を使わなくても、RasPI5からのPTT ON信号でPA・LNAの送受信切替を制御できます。送信中はPi 5のGPIO21(40番ピン、GNDは39番ピン)がHIGH(3.3V)、受信中はLOWになります。Shonan_Liteの送信とLangstone V3の送信(Langstone標準のTx Output)のどちらでも同じピンに出力されます。GPIO21は3.3Vロジックで電流を取れないため、トランジスタやリレードライバ等でバッファしてからPA・LNA(同軸リレー等)を駆動してください。12V電源のON/OFFとホーム画面の「Pluto電源」カードはESP32 W5500が必要です。</w:t>
+      </w:r>
+    </w:p>
+    <w:p>
+      <w:r>
+        <w:rPr>
+          <w:color w:val="404040"/>
+        </w:rPr>
+        <w:t>Even without the ESP32 W5500 (PA_Power/PTT controller), the PA and LNA can be switched between TX and RX by the PTT ON signal from the RasPI5. GPIO21 on the Pi 5 (pin 40; GND on pin 39) is HIGH (3.3 V) while transmitting and LOW while receiving. The same pin is driven both when transmitting with Shonan_Lite and when transmitting with Langstone V3 (Langstone's standard Tx Output). GPIO21 is a 3.3 V logic output that cannot supply current, so buffer it with a transistor, relay driver or similar before driving the PA and LNA (coax relays, etc.). Switching the 12 V power ON/OFF and the "Pluto Power" card on the Home screen still require the ESP32 W5500.</w:t>
       </w:r>
     </w:p>
     <w:p>

</xml_diff>